<commit_message>
Update data-sources summary: 6 providers incl. OpenAI, 104 items, demo mode, 50 tests
</commit_message>
<xml_diff>
--- a/DATA_SOURCES_SUMMARY.docx
+++ b/DATA_SOURCES_SUMMARY.docx
@@ -22,7 +22,7 @@
         <w:rPr>
           <w:i/>
         </w:rPr>
-        <w:t xml:space="preserve">As of 2026-06-27</w:t>
+        <w:t xml:space="preserve">As of 2026-06-26</w:t>
       </w:r>
     </w:p>
     <w:p>
@@ -66,7 +66,7 @@
         <w:t xml:space="preserve">Azure Kubernetes Service</w:t>
       </w:r>
       <w:r>
-        <w:t xml:space="preserve"> (included as the self-hosted / do-it-yourself (DIY) way to run models), and </w:t>
+        <w:t xml:space="preserve"> (included as the self-hosted / do-it-yourself (DIY) way to run models), </w:t>
       </w:r>
       <w:r>
         <w:rPr>
@@ -75,13 +75,22 @@
         <w:t xml:space="preserve">Azure Machine Learning</w:t>
       </w:r>
       <w:r>
-        <w:t xml:space="preserve"> — Microsoft's managed ML platform for model training and managed online endpoints (inference) — in contrast to the three independent managed inference APIs. It currently displays </w:t>
-      </w:r>
-      <w:r>
-        <w:rPr>
-          <w:b/>
-        </w:rPr>
-        <w:t xml:space="preserve">84 items</w:t>
+        <w:t xml:space="preserve"> — Microsoft's managed ML platform for model training and managed online endpoints (inference) — and the </w:t>
+      </w:r>
+      <w:r>
+        <w:rPr>
+          <w:b/>
+        </w:rPr>
+        <w:t xml:space="preserve">OpenAI API</w:t>
+      </w:r>
+      <w:r>
+        <w:t xml:space="preserve"> (api.openai.com), OpenAI's hosted inference API for chat/Responses, embeddings, audio, images, and the Realtime API. It currently displays </w:t>
+      </w:r>
+      <w:r>
+        <w:rPr>
+          <w:b/>
+        </w:rPr>
+        <w:t xml:space="preserve">104 items</w:t>
       </w:r>
       <w:r>
         <w:t xml:space="preserve"> — </w:t>
@@ -90,19 +99,19 @@
         <w:rPr>
           <w:b/>
         </w:rPr>
-        <w:t xml:space="preserve">13 hand-verified</w:t>
-      </w:r>
-      <w:r>
-        <w:t xml:space="preserve"> (10 Together AI, 3 Fireworks AI) plus </w:t>
-      </w:r>
-      <w:r>
-        <w:rPr>
-          <w:b/>
-        </w:rPr>
-        <w:t xml:space="preserve">71 auto-collected</w:t>
-      </w:r>
-      <w:r>
-        <w:t xml:space="preserve"> (15 from Hacker News, 56 from GitHub issues). Every item is linked to its original public source.</w:t>
+        <w:t xml:space="preserve">37 hand-curated</w:t>
+      </w:r>
+      <w:r>
+        <w:t xml:space="preserve"> (10 Together AI, 3 Fireworks AI, 11 Azure Machine Learning, 13 OpenAI) plus </w:t>
+      </w:r>
+      <w:r>
+        <w:rPr>
+          <w:b/>
+        </w:rPr>
+        <w:t xml:space="preserve">67 auto-collected</w:t>
+      </w:r>
+      <w:r>
+        <w:t xml:space="preserve"> (15 from Hacker News, 52 from GitHub issues). Every item is linked to its original public source.</w:t>
       </w:r>
     </w:p>
     <w:p>
@@ -331,7 +340,7 @@
         <w:t xml:space="preserve">GitHub issue</w:t>
       </w:r>
       <w:r>
-        <w:t xml:space="preserve"> mentions of all five providers, removes duplicates, and adds any new items.</w:t>
+        <w:t xml:space="preserve"> mentions of all six providers, removes duplicates, and adds any new items.</w:t>
       </w:r>
     </w:p>
     <w:p>
@@ -554,7 +563,7 @@
         <w:rPr>
           <w:b/>
         </w:rPr>
-        <w:t xml:space="preserve">Together AI vs Fireworks AI vs Tinker API vs Azure Kubernetes Service</w:t>
+        <w:t xml:space="preserve">Together AI vs Fireworks AI vs Tinker API vs Azure Kubernetes Service vs Azure Machine Learning vs OpenAI</w:t>
       </w:r>
       <w:r>
         <w:t xml:space="preserve"> view of feedback by category, so you can instantly see which provider draws more complaints in each area.</w:t>
@@ -594,6 +603,43 @@
       </w:r>
       <w:r>
         <w:t xml:space="preserve"> — shows when the data was last refreshed, reinforcing that it is live.</w:t>
+      </w:r>
+    </w:p>
+    <w:p>
+      <w:pPr>
+        <w:spacing w:after="60"/>
+        <w:ind w:left="360" w:hanging="220"/>
+      </w:pPr>
+      <w:r>
+        <w:t xml:space="preserve">•  </w:t>
+      </w:r>
+      <w:r>
+        <w:rPr>
+          <w:b/>
+        </w:rPr>
+        <w:t xml:space="preserve">Guided demo mode</w:t>
+      </w:r>
+      <w:r>
+        <w:t xml:space="preserve"> — an opt-in </w:t>
+      </w:r>
+      <w:r>
+        <w:rPr>
+          <w:b/>
+        </w:rPr>
+        <w:t xml:space="preserve">▶ Demo</w:t>
+      </w:r>
+      <w:r>
+        <w:t xml:space="preserve"> button (and </w:t>
+      </w:r>
+      <w:r>
+        <w:rPr>
+          <w:rFonts w:ascii="Consolas" w:hAnsi="Consolas"/>
+          <w:color w:val="B5179E"/>
+        </w:rPr>
+        <w:t xml:space="preserve">?demo=1</w:t>
+      </w:r>
+      <w:r>
+        <w:t xml:space="preserve"> URL) plays a self-driving, captioned auto-tour of the whole dashboard (scrolling, spotlighting each section, toggling the trend breakdown, filtering, searching, and exporting) so the project can be screen-recorded hands-free. It uses the real filters and leaves the normal experience untouched.</w:t>
       </w:r>
     </w:p>
     <w:p>
@@ -677,10 +723,10 @@
         <w:rPr>
           <w:b/>
         </w:rPr>
-        <w:t xml:space="preserve">Verified items</w:t>
-      </w:r>
-      <w:r>
-        <w:t xml:space="preserve"> (13) are hand-curated and source-cited.</w:t>
+        <w:t xml:space="preserve">Hand-curated items</w:t>
+      </w:r>
+      <w:r>
+        <w:t xml:space="preserve"> (37) are written and source-cited by hand.</w:t>
       </w:r>
     </w:p>
     <w:p>
@@ -1057,10 +1103,10 @@
         <w:rPr>
           <w:b/>
         </w:rPr>
-        <w:t xml:space="preserve">48 tests</w:t>
-      </w:r>
-      <w:r>
-        <w:t xml:space="preserve">) passes. Tests read a frozen copy of the curated 13-item dataset, so daily collection can never break them.</w:t>
+        <w:t xml:space="preserve">50 tests</w:t>
+      </w:r>
+      <w:r>
+        <w:t xml:space="preserve">) passes. Tests read a frozen copy of a curated fixture dataset, so daily collection can never break them.</w:t>
       </w:r>
     </w:p>
     <w:p>
@@ -1292,7 +1338,7 @@
         <w:spacing w:after="120"/>
       </w:pPr>
       <w:r>
-        <w:t xml:space="preserve">The dashboard is connected to its API, serving live data, and maintains itself — refreshing from a full year of Hacker News and GitHub issues daily and restarting automatically at login. It now tracks five providers (Together AI, Fireworks AI, Tinker API, Azure Kubernetes Service — the self-hosted / DIY option — and Azure Machine Learning, Microsoft's managed ML platform). On top of the core MVP it now includes an auto-written executive summary, a sentiment-over-time chart, a "most common issue" callout, a side-by-side provider comparison, CSV/JSON export, and a last-updated timestamp. Hacker News, GitHub issues, and the official status pages are the feedback sources feeding it right now; the remaining sources are researched and ready to wire in once access constraints (OAuth tokens, paid API tiers) are resolved.</w:t>
+        <w:t xml:space="preserve">The dashboard is connected to its API, serving live data, and maintains itself — refreshing from a full year of Hacker News and GitHub issues daily and restarting automatically at login. It now tracks six providers (Together AI, Fireworks AI, Tinker API, Azure Kubernetes Service — the self-hosted / DIY option —, Azure Machine Learning — Microsoft's managed ML platform — and the OpenAI API). On top of the core MVP it now includes an auto-written executive summary, a sentiment-over-time chart, a "most common issue" callout, a side-by-side provider comparison, CSV/JSON export, a last-updated timestamp, and a one-click guided demo / auto-tour for screen recordings. Hacker News, GitHub issues, and the official status pages are the feedback sources feeding it right now; the remaining sources are researched and ready to wire in once access constraints (OAuth tokens, paid API tiers) are resolved.</w:t>
       </w:r>
     </w:p>
     <w:sectPr>

</xml_diff>

<commit_message>
Auto-regenerate DATA_SOURCES_SUMMARY (md+docx) from live data in daily refresh
</commit_message>
<xml_diff>
--- a/DATA_SOURCES_SUMMARY.docx
+++ b/DATA_SOURCES_SUMMARY.docx
@@ -22,7 +22,7 @@
         <w:rPr>
           <w:i/>
         </w:rPr>
-        <w:t xml:space="preserve">As of 2026-06-26</w:t>
+        <w:t xml:space="preserve">As of 2026-06-27</w:t>
       </w:r>
     </w:p>
     <w:p>
@@ -84,13 +84,21 @@
         <w:t xml:space="preserve">OpenAI API</w:t>
       </w:r>
       <w:r>
-        <w:t xml:space="preserve"> (api.openai.com), OpenAI's hosted inference API for chat/Responses, embeddings, audio, images, and the Realtime API. It currently displays </w:t>
-      </w:r>
-      <w:r>
-        <w:rPr>
-          <w:b/>
-        </w:rPr>
-        <w:t xml:space="preserve">104 items</w:t>
+        <w:t xml:space="preserve"> (api.openai.com), OpenAI's hosted inference API for chat/Responses, embeddings, audio, images, and the Realtime API.</w:t>
+      </w:r>
+    </w:p>
+    <w:p>
+      <w:pPr>
+        <w:spacing w:after="120"/>
+      </w:pPr>
+      <w:r>
+        <w:t xml:space="preserve">It currently displays </w:t>
+      </w:r>
+      <w:r>
+        <w:rPr>
+          <w:b/>
+        </w:rPr>
+        <w:t xml:space="preserve">129 items</w:t>
       </w:r>
       <w:r>
         <w:t xml:space="preserve"> — </w:t>
@@ -108,10 +116,10 @@
         <w:rPr>
           <w:b/>
         </w:rPr>
-        <w:t xml:space="preserve">67 auto-collected</w:t>
-      </w:r>
-      <w:r>
-        <w:t xml:space="preserve"> (15 from Hacker News, 52 from GitHub issues). Every item is linked to its original public source.</w:t>
+        <w:t xml:space="preserve">92 auto-collected</w:t>
+      </w:r>
+      <w:r>
+        <w:t xml:space="preserve"> (15 from Hacker News, 77 from GitHub issues). Every item is linked to its original public source.</w:t>
       </w:r>
     </w:p>
     <w:p>
@@ -726,7 +734,7 @@
         <w:t xml:space="preserve">Hand-curated items</w:t>
       </w:r>
       <w:r>
-        <w:t xml:space="preserve"> (37) are written and source-cited by hand.</w:t>
+        <w:t xml:space="preserve"> are written and source-cited by hand.</w:t>
       </w:r>
     </w:p>
     <w:p>
@@ -744,7 +752,7 @@
         <w:t xml:space="preserve">Auto-collected items</w:t>
       </w:r>
       <w:r>
-        <w:t xml:space="preserve"> (67) carry a yellow </w:t>
+        <w:t xml:space="preserve"> carry a yellow </w:t>
       </w:r>
       <w:r>
         <w:rPr>

</xml_diff>

<commit_message>
Add providers, sources, dashboard UX overhaul, and workflow docs
- New providers: Azure AI Foundry, Azure ML, AKS, OpenAI, Tinker
- New no-auth sources: Stack Exchange (multi-site), Discourse, Dev.to, statuspage Atom, third-party integration repos; opt-in Bluesky
- Merge status_page/statuspage source in normalizer
- Backend filters: source, sentiment, verified, date range
- Frontend: filters+live chart, product view, provider health, pagination, shareable URL, dropdown-driven charts, zone layout
- Automation: daily refresh + auto-synced docs/summaries
- Add workflow/ docs
</commit_message>
<xml_diff>
--- a/DATA_SOURCES_SUMMARY.docx
+++ b/DATA_SOURCES_SUMMARY.docx
@@ -22,7 +22,7 @@
         <w:rPr>
           <w:i/>
         </w:rPr>
-        <w:t xml:space="preserve">As of 2026-06-27</w:t>
+        <w:t xml:space="preserve">As of 2026-07-09</w:t>
       </w:r>
     </w:p>
     <w:p>
@@ -98,7 +98,7 @@
         <w:rPr>
           <w:b/>
         </w:rPr>
-        <w:t xml:space="preserve">129 items</w:t>
+        <w:t xml:space="preserve">366 items</w:t>
       </w:r>
       <w:r>
         <w:t xml:space="preserve"> — </w:t>
@@ -116,10 +116,10 @@
         <w:rPr>
           <w:b/>
         </w:rPr>
-        <w:t xml:space="preserve">92 auto-collected</w:t>
-      </w:r>
-      <w:r>
-        <w:t xml:space="preserve"> (15 from Hacker News, 77 from GitHub issues). Every item is linked to its original public source.</w:t>
+        <w:t xml:space="preserve">329 auto-collected</w:t>
+      </w:r>
+      <w:r>
+        <w:t xml:space="preserve"> (67 from Status page, 25 from Hacker News, 121 from GitHub issues, 97 from Stack Overflow, 12 from serverfault, 6 from devops-stackexchange, 1 from Community Forum). Every item is linked to its original public source.</w:t>
       </w:r>
     </w:p>
     <w:p>

</xml_diff>

<commit_message>
Update dashboard frontend and refresh feedback data
</commit_message>
<xml_diff>
--- a/DATA_SOURCES_SUMMARY.docx
+++ b/DATA_SOURCES_SUMMARY.docx
@@ -22,7 +22,7 @@
         <w:rPr>
           <w:i/>
         </w:rPr>
-        <w:t xml:space="preserve">As of 2026-07-09</w:t>
+        <w:t xml:space="preserve">As of 2026-07-20</w:t>
       </w:r>
     </w:p>
     <w:p>
@@ -98,7 +98,7 @@
         <w:rPr>
           <w:b/>
         </w:rPr>
-        <w:t xml:space="preserve">366 items</w:t>
+        <w:t xml:space="preserve">424 items</w:t>
       </w:r>
       <w:r>
         <w:t xml:space="preserve"> — </w:t>
@@ -116,10 +116,10 @@
         <w:rPr>
           <w:b/>
         </w:rPr>
-        <w:t xml:space="preserve">329 auto-collected</w:t>
-      </w:r>
-      <w:r>
-        <w:t xml:space="preserve"> (67 from Status page, 25 from Hacker News, 121 from GitHub issues, 97 from Stack Overflow, 12 from serverfault, 6 from devops-stackexchange, 1 from Community Forum). Every item is linked to its original public source.</w:t>
+        <w:t xml:space="preserve">387 auto-collected</w:t>
+      </w:r>
+      <w:r>
+        <w:t xml:space="preserve"> (99 from Status page, 26 from Hacker News, 138 from GitHub issues, 97 from Stack Overflow, 12 from serverfault, 6 from devops-stackexchange, 9 from Community Forum). Every item is linked to its original public source.</w:t>
       </w:r>
     </w:p>
     <w:p>

</xml_diff>

<commit_message>
Refresh feedback data and project documentation
</commit_message>
<xml_diff>
--- a/DATA_SOURCES_SUMMARY.docx
+++ b/DATA_SOURCES_SUMMARY.docx
@@ -22,7 +22,7 @@
         <w:rPr>
           <w:i/>
         </w:rPr>
-        <w:t xml:space="preserve">As of 2026-07-20</w:t>
+        <w:t xml:space="preserve">As of 2026-09-03</w:t>
       </w:r>
     </w:p>
     <w:p>
@@ -98,7 +98,7 @@
         <w:rPr>
           <w:b/>
         </w:rPr>
-        <w:t xml:space="preserve">424 items</w:t>
+        <w:t xml:space="preserve">567 items</w:t>
       </w:r>
       <w:r>
         <w:t xml:space="preserve"> — </w:t>
@@ -116,10 +116,10 @@
         <w:rPr>
           <w:b/>
         </w:rPr>
-        <w:t xml:space="preserve">387 auto-collected</w:t>
-      </w:r>
-      <w:r>
-        <w:t xml:space="preserve"> (99 from Status page, 26 from Hacker News, 138 from GitHub issues, 97 from Stack Overflow, 12 from serverfault, 6 from devops-stackexchange, 9 from Community Forum). Every item is linked to its original public source.</w:t>
+        <w:t xml:space="preserve">530 auto-collected</w:t>
+      </w:r>
+      <w:r>
+        <w:t xml:space="preserve"> (141 from Status page, 29 from Hacker News, 219 from GitHub issues, 99 from Stack Overflow, 12 from serverfault, 6 from devops-stackexchange, 24 from Community Forum). Every item is linked to its original public source.</w:t>
       </w:r>
     </w:p>
     <w:p>

</xml_diff>